<commit_message>
Comprimir fotos en el navegador antes de subirlas a Storage
Las fotos de comprobante/odometro se redimensionan (max 1600px de lado
mayor) y reexportan a JPEG via Canvas antes de subirse - una foto de camara
sin comprimir puede pesar varios MB, esto reduce el espacio usado en
Storage y acelera el envio. Si la compresion falla se sube el archivo
original, para no bloquear el envio.
</commit_message>
<xml_diff>
--- a/descripcion del sistema.docx
+++ b/descripcion del sistema.docx
@@ -5387,6 +5387,38 @@
           <w:i w:val="false"/>
           <w:iCs w:val="false"/>
         </w:rPr>
+        <w:t xml:space="preserve">Las fotos se comprimen en el navegador antes de subirse (</w:t>
+      </w:r>
+      <w:r>
+        <w:rPr>
+          <w:rFonts w:ascii="Consolas" w:cs="Consolas" w:eastAsia="Consolas" w:hAnsi="Consolas"/>
+          <w:i w:val="false"/>
+          <w:iCs w:val="false"/>
+        </w:rPr>
+        <w:t xml:space="preserve">compressImage</w:t>
+      </w:r>
+      <w:r>
+        <w:rPr>
+          <w:i w:val="false"/>
+          <w:iCs w:val="false"/>
+        </w:rPr>
+        <w:t xml:space="preserve">: redimensiona a máx. 1600px de lado mayor y reexporta como JPEG calidad ~0.82 vía Canvas) — una foto de cámara de celular puede pesar varios MB; comprimida ocupa una fracción del espacio en Storage y sube más rápido. Si la compresión falla, se sube el archivo original sin bloquear el envío.</w:t>
+      </w:r>
+    </w:p>
+    <w:p>
+      <w:pPr>
+        <w:pStyle w:val="ListParagraph"/>
+        <w:numPr>
+          <w:ilvl w:val="0"/>
+          <w:numId w:val="1"/>
+        </w:numPr>
+        <w:spacing w:after="40"/>
+      </w:pPr>
+      <w:r>
+        <w:rPr>
+          <w:i w:val="false"/>
+          <w:iCs w:val="false"/>
+        </w:rPr>
         <w:t xml:space="preserve">Las fotos se suben a Supabase Storage (bucket privado </w:t>
       </w:r>
       <w:r>
@@ -5418,6 +5450,46 @@
           <w:iCs w:val="false"/>
         </w:rPr>
         <w:t xml:space="preserve">) usando la sesión del propio empleado (RLS, no el cliente admin) — coherente con "cada quien sube lo suyo".</w:t>
+      </w:r>
+    </w:p>
+    <w:p>
+      <w:pPr>
+        <w:pStyle w:val="ListParagraph"/>
+        <w:numPr>
+          <w:ilvl w:val="0"/>
+          <w:numId w:val="1"/>
+        </w:numPr>
+        <w:spacing w:after="40"/>
+      </w:pPr>
+      <w:r>
+        <w:rPr>
+          <w:rFonts w:ascii="Consolas" w:cs="Consolas" w:eastAsia="Consolas" w:hAnsi="Consolas"/>
+          <w:i w:val="false"/>
+          <w:iCs w:val="false"/>
+        </w:rPr>
+        <w:t xml:space="preserve">next.config.ts</w:t>
+      </w:r>
+      <w:r>
+        <w:rPr>
+          <w:i w:val="false"/>
+          <w:iCs w:val="false"/>
+        </w:rPr>
+        <w:t xml:space="preserve"> sube el límite de tamaño de envío de Server Actions a 25 MB (</w:t>
+      </w:r>
+      <w:r>
+        <w:rPr>
+          <w:rFonts w:ascii="Consolas" w:cs="Consolas" w:eastAsia="Consolas" w:hAnsi="Consolas"/>
+          <w:i w:val="false"/>
+          <w:iCs w:val="false"/>
+        </w:rPr>
+        <w:t xml:space="preserve">experimental.serverActions.bodySizeLimit</w:t>
+      </w:r>
+      <w:r>
+        <w:rPr>
+          <w:i w:val="false"/>
+          <w:iCs w:val="false"/>
+        </w:rPr>
+        <w:t xml:space="preserve">) — el límite por defecto de Next (1 MB) es insuficiente para una foto de cámara sin comprimir, y kilometraje manda 2 fotos en el mismo envío.</w:t>
       </w:r>
     </w:p>
     <w:p>

</xml_diff>

<commit_message>
Vista semanal de reportes del empleado + PIN de 4 digitos
- Nueva tarjeta "Mi semana" en /empleado: 7 dias con una bolita por dia
  mostrando cuantos de los 3 reportes diarios (desayuno/almuerzo/cena) ya
  se enviaron (gris 0, ambar 1-2, verde 3). Kilometraje no cuenta (puede
  haber varios trayectos el mismo dia).
- Cada dia enlaza a /empleado/dia/[fecha], que muestra el estado de cada
  tipo de comida ese dia y un boton "Reportar" para el que falte (con la
  fecha ya puesta). Enviar un gasto de comida ahora redirige de vuelta a
  esa vista del dia en vez de a Mis Gastos.
- Contrasena temporal/PIN generado baja de 6 a 4 digitos (mas facil para
  empleados con poca familiaridad con contrasenas) - requiere bajar la
  longitud minima de password en Supabase Auth a 4, documentado en
  docs/supabase-setup.md
</commit_message>
<xml_diff>
--- a/descripcion del sistema.docx
+++ b/descripcion del sistema.docx
@@ -4841,7 +4841,7 @@
           <w:i w:val="false"/>
           <w:iCs w:val="false"/>
         </w:rPr>
-        <w:t xml:space="preserve">: el campo trae un PIN de 6 dígitos generado como sugerencia, con botón "Generar" para otro nuevo, pero el admin puede escribir la que quiera (mínimo 6 caracteres).</w:t>
+        <w:t xml:space="preserve">: el campo trae un PIN de 4 dígitos generado como sugerencia, con botón "Generar" para otro nuevo, pero el admin puede escribir la que quiera (mínimo 4 caracteres — requiere que en Supabase la longitud mínima de contraseña esté en 4, ver docs/supabase-setup.md).</w:t>
       </w:r>
     </w:p>
     <w:p>
@@ -4949,7 +4949,7 @@
           <w:i w:val="false"/>
           <w:iCs w:val="false"/>
         </w:rPr>
-        <w:t xml:space="preserve"> o similar) y contraseña temporal — un PIN numérico de 6 dígitos en vez de una contraseña alfanumérica, para que sea fácil de leer y escribir por empleados con poca familiaridad con contraseñas. Muestra una tabla con ID+usuario+contraseña de cada una para repartirlas. Más adelante, cuando el admin sabe a qué persona le va a asignar cada cuenta, la identifica por su ID y le pone el nombre real desde "Editar" — no hay que volver a crearla. El ID también se puede escribir a mano al crear un empleado individual (columna "ID" en la tabla, campo </w:t>
+        <w:t xml:space="preserve"> o similar) y contraseña temporal — un PIN numérico de 4 dígitos en vez de una contraseña alfanumérica, para que sea fácil de leer y escribir por empleados con poca familiaridad con contraseñas. Muestra una tabla con ID+usuario+contraseña de cada una para repartirlas. Más adelante, cuando el admin sabe a qué persona le va a asignar cada cuenta, la identifica por su ID y le pone el nombre real desde "Editar" — no hay que volver a crearla. El ID también se puede escribir a mano al crear un empleado individual (columna "ID" en la tabla, campo </w:t>
       </w:r>
       <w:r>
         <w:rPr>
@@ -5490,6 +5490,100 @@
           <w:iCs w:val="false"/>
         </w:rPr>
         <w:t xml:space="preserve">) — el límite por defecto de Next (1 MB) es insuficiente para una foto de cámara sin comprimir, y kilometraje manda 2 fotos en el mismo envío.</w:t>
+      </w:r>
+    </w:p>
+    <w:p>
+      <w:pPr>
+        <w:pStyle w:val="ListParagraph"/>
+        <w:numPr>
+          <w:ilvl w:val="0"/>
+          <w:numId w:val="1"/>
+        </w:numPr>
+        <w:spacing w:after="40"/>
+      </w:pPr>
+      <w:r>
+        <w:rPr>
+          <w:i w:val="false"/>
+          <w:iCs w:val="false"/>
+        </w:rPr>
+        <w:t xml:space="preserve">Inicio del empleado (</w:t>
+      </w:r>
+      <w:r>
+        <w:rPr>
+          <w:rFonts w:ascii="Consolas" w:cs="Consolas" w:eastAsia="Consolas" w:hAnsi="Consolas"/>
+          <w:i w:val="false"/>
+          <w:iCs w:val="false"/>
+        </w:rPr>
+        <w:t xml:space="preserve">/empleado</w:t>
+      </w:r>
+      <w:r>
+        <w:rPr>
+          <w:i w:val="false"/>
+          <w:iCs w:val="false"/>
+        </w:rPr>
+        <w:t xml:space="preserve">): tarjeta "Mi semana" (</w:t>
+      </w:r>
+      <w:r>
+        <w:rPr>
+          <w:rFonts w:ascii="Consolas" w:cs="Consolas" w:eastAsia="Consolas" w:hAnsi="Consolas"/>
+          <w:i w:val="false"/>
+          <w:iCs w:val="false"/>
+        </w:rPr>
+        <w:t xml:space="preserve">WeekTracker</w:t>
+      </w:r>
+      <w:r>
+        <w:rPr>
+          <w:i w:val="false"/>
+          <w:iCs w:val="false"/>
+        </w:rPr>
+        <w:t xml:space="preserve">) con los 7 días de la semana actual (lunes a domingo) y una bolita por día con el número de reportes diarios (Desayuno/Almuerzo/Cena, 0 a 3) que ya envió — gris si 0, ámbar si 1-2, verde si 3. Kilometraje no cuenta para esta bolita porque puede haber varios trayectos el mismo día, no es "uno por día" como las comidas.</w:t>
+      </w:r>
+    </w:p>
+    <w:p>
+      <w:pPr>
+        <w:pStyle w:val="ListParagraph"/>
+        <w:numPr>
+          <w:ilvl w:val="0"/>
+          <w:numId w:val="1"/>
+        </w:numPr>
+        <w:spacing w:after="40"/>
+      </w:pPr>
+      <w:r>
+        <w:rPr>
+          <w:i w:val="false"/>
+          <w:iCs w:val="false"/>
+        </w:rPr>
+        <w:t xml:space="preserve">Cada día es un enlace a </w:t>
+      </w:r>
+      <w:r>
+        <w:rPr>
+          <w:rFonts w:ascii="Consolas" w:cs="Consolas" w:eastAsia="Consolas" w:hAnsi="Consolas"/>
+          <w:i w:val="false"/>
+          <w:iCs w:val="false"/>
+        </w:rPr>
+        <w:t xml:space="preserve">/empleado/dia/[fecha]</w:t>
+      </w:r>
+      <w:r>
+        <w:rPr>
+          <w:i w:val="false"/>
+          <w:iCs w:val="false"/>
+        </w:rPr>
+        <w:t xml:space="preserve">, que muestra los 3 tipos de comida del día: si ya se reportó, su estado (Reportado/Aprobado/Rechazado con motivo); si falta, un botón "Reportar" que lleva al formulario de esa categoría con la fecha ya puesta (parámetro </w:t>
+      </w:r>
+      <w:r>
+        <w:rPr>
+          <w:rFonts w:ascii="Consolas" w:cs="Consolas" w:eastAsia="Consolas" w:hAnsi="Consolas"/>
+          <w:i w:val="false"/>
+          <w:iCs w:val="false"/>
+        </w:rPr>
+        <w:t xml:space="preserve">?date=</w:t>
+      </w:r>
+      <w:r>
+        <w:rPr>
+          <w:i w:val="false"/>
+          <w:iCs w:val="false"/>
+        </w:rPr>
+        <w:t xml:space="preserve">). Al enviar un gasto de comida, el sistema redirige de vuelta a esta vista del día (en vez de a "Mis Gastos") para poder seguir completando lo que falte de una vez.</w:t>
       </w:r>
     </w:p>
     <w:p>

</xml_diff>